<commit_message>
Updated and docs, added how json_serializable hhandles nested key mapping
</commit_message>
<xml_diff>
--- a/python/p6_python_lambda_and_void_callback_methods_and_more.docx
+++ b/python/p6_python_lambda_and_void_callback_methods_and_more.docx
@@ -344,7 +344,29 @@
           <w:sz w:val="36"/>
           <w:szCs w:val="36"/>
         </w:rPr>
-        <w:t>lambda parameters : expression</w:t>
+        <w:t xml:space="preserve">lambda </w:t>
+      </w:r>
+      <w:proofErr w:type="gramStart"/>
+      <w:r>
+        <w:rPr>
+          <w:rFonts w:ascii="Calibri" w:hAnsi="Calibri" w:cs="Calibri"/>
+          <w:b/>
+          <w:bCs/>
+          <w:sz w:val="36"/>
+          <w:szCs w:val="36"/>
+        </w:rPr>
+        <w:t>parameters :</w:t>
+      </w:r>
+      <w:proofErr w:type="gramEnd"/>
+      <w:r>
+        <w:rPr>
+          <w:rFonts w:ascii="Calibri" w:hAnsi="Calibri" w:cs="Calibri"/>
+          <w:b/>
+          <w:bCs/>
+          <w:sz w:val="36"/>
+          <w:szCs w:val="36"/>
+        </w:rPr>
+        <w:t xml:space="preserve"> expression</w:t>
       </w:r>
     </w:p>
     <w:p>
@@ -462,7 +484,31 @@
           <w:sz w:val="36"/>
           <w:szCs w:val="36"/>
         </w:rPr>
-        <w:t>print(square(5)) # 25</w:t>
+        <w:t>print(</w:t>
+      </w:r>
+      <w:proofErr w:type="gramStart"/>
+      <w:r>
+        <w:rPr>
+          <w:rFonts w:ascii="Calibri" w:hAnsi="Calibri" w:cs="Calibri"/>
+          <w:b/>
+          <w:bCs/>
+          <w:color w:val="D86DCB" w:themeColor="accent5" w:themeTint="99"/>
+          <w:sz w:val="36"/>
+          <w:szCs w:val="36"/>
+        </w:rPr>
+        <w:t>square(</w:t>
+      </w:r>
+      <w:proofErr w:type="gramEnd"/>
+      <w:r>
+        <w:rPr>
+          <w:rFonts w:ascii="Calibri" w:hAnsi="Calibri" w:cs="Calibri"/>
+          <w:b/>
+          <w:bCs/>
+          <w:color w:val="D86DCB" w:themeColor="accent5" w:themeTint="99"/>
+          <w:sz w:val="36"/>
+          <w:szCs w:val="36"/>
+        </w:rPr>
+        <w:t>5)) # 25</w:t>
       </w:r>
     </w:p>
     <w:p>
@@ -504,31 +550,79 @@
           <w:sz w:val="36"/>
           <w:szCs w:val="36"/>
         </w:rPr>
-        <w:t>square = lambda x : x * x</w:t>
-      </w:r>
-    </w:p>
-    <w:p>
-      <w:pPr>
-        <w:jc w:val="both"/>
-        <w:rPr>
-          <w:rFonts w:ascii="Calibri" w:hAnsi="Calibri" w:cs="Calibri"/>
-          <w:b/>
-          <w:bCs/>
-          <w:color w:val="D86DCB" w:themeColor="accent5" w:themeTint="99"/>
-          <w:sz w:val="36"/>
-          <w:szCs w:val="36"/>
-        </w:rPr>
-      </w:pPr>
-      <w:r>
-        <w:rPr>
-          <w:rFonts w:ascii="Calibri" w:hAnsi="Calibri" w:cs="Calibri"/>
-          <w:b/>
-          <w:bCs/>
-          <w:color w:val="D86DCB" w:themeColor="accent5" w:themeTint="99"/>
-          <w:sz w:val="36"/>
-          <w:szCs w:val="36"/>
-        </w:rPr>
-        <w:t>print(square(5)) # 25</w:t>
+        <w:t xml:space="preserve">square = lambda </w:t>
+      </w:r>
+      <w:proofErr w:type="gramStart"/>
+      <w:r>
+        <w:rPr>
+          <w:rFonts w:ascii="Calibri" w:hAnsi="Calibri" w:cs="Calibri"/>
+          <w:b/>
+          <w:bCs/>
+          <w:color w:val="D86DCB" w:themeColor="accent5" w:themeTint="99"/>
+          <w:sz w:val="36"/>
+          <w:szCs w:val="36"/>
+        </w:rPr>
+        <w:t>x :</w:t>
+      </w:r>
+      <w:proofErr w:type="gramEnd"/>
+      <w:r>
+        <w:rPr>
+          <w:rFonts w:ascii="Calibri" w:hAnsi="Calibri" w:cs="Calibri"/>
+          <w:b/>
+          <w:bCs/>
+          <w:color w:val="D86DCB" w:themeColor="accent5" w:themeTint="99"/>
+          <w:sz w:val="36"/>
+          <w:szCs w:val="36"/>
+        </w:rPr>
+        <w:t xml:space="preserve"> x * x</w:t>
+      </w:r>
+    </w:p>
+    <w:p>
+      <w:pPr>
+        <w:jc w:val="both"/>
+        <w:rPr>
+          <w:rFonts w:ascii="Calibri" w:hAnsi="Calibri" w:cs="Calibri"/>
+          <w:b/>
+          <w:bCs/>
+          <w:color w:val="D86DCB" w:themeColor="accent5" w:themeTint="99"/>
+          <w:sz w:val="36"/>
+          <w:szCs w:val="36"/>
+        </w:rPr>
+      </w:pPr>
+      <w:r>
+        <w:rPr>
+          <w:rFonts w:ascii="Calibri" w:hAnsi="Calibri" w:cs="Calibri"/>
+          <w:b/>
+          <w:bCs/>
+          <w:color w:val="D86DCB" w:themeColor="accent5" w:themeTint="99"/>
+          <w:sz w:val="36"/>
+          <w:szCs w:val="36"/>
+        </w:rPr>
+        <w:t>print(</w:t>
+      </w:r>
+      <w:proofErr w:type="gramStart"/>
+      <w:r>
+        <w:rPr>
+          <w:rFonts w:ascii="Calibri" w:hAnsi="Calibri" w:cs="Calibri"/>
+          <w:b/>
+          <w:bCs/>
+          <w:color w:val="D86DCB" w:themeColor="accent5" w:themeTint="99"/>
+          <w:sz w:val="36"/>
+          <w:szCs w:val="36"/>
+        </w:rPr>
+        <w:t>square(</w:t>
+      </w:r>
+      <w:proofErr w:type="gramEnd"/>
+      <w:r>
+        <w:rPr>
+          <w:rFonts w:ascii="Calibri" w:hAnsi="Calibri" w:cs="Calibri"/>
+          <w:b/>
+          <w:bCs/>
+          <w:color w:val="D86DCB" w:themeColor="accent5" w:themeTint="99"/>
+          <w:sz w:val="36"/>
+          <w:szCs w:val="36"/>
+        </w:rPr>
+        <w:t>5)) # 25</w:t>
       </w:r>
     </w:p>
     <w:p>
@@ -599,59 +693,114 @@
           <w:szCs w:val="36"/>
         </w:rPr>
         <w:lastRenderedPageBreak/>
-        <w:t>add = lambda a, b : a + b</w:t>
-      </w:r>
-    </w:p>
-    <w:p>
-      <w:pPr>
-        <w:jc w:val="both"/>
-        <w:rPr>
-          <w:rFonts w:ascii="Calibri" w:hAnsi="Calibri" w:cs="Calibri"/>
-          <w:b/>
-          <w:bCs/>
-          <w:color w:val="D86DCB" w:themeColor="accent5" w:themeTint="99"/>
-          <w:sz w:val="36"/>
-          <w:szCs w:val="36"/>
-        </w:rPr>
-      </w:pPr>
-      <w:r>
-        <w:rPr>
-          <w:rFonts w:ascii="Calibri" w:hAnsi="Calibri" w:cs="Calibri"/>
-          <w:b/>
-          <w:bCs/>
-          <w:color w:val="D86DCB" w:themeColor="accent5" w:themeTint="99"/>
-          <w:sz w:val="36"/>
-          <w:szCs w:val="36"/>
-        </w:rPr>
-        <w:t>print(add(10 ,20)) # 30</w:t>
-      </w:r>
-    </w:p>
-    <w:p>
-      <w:pPr>
-        <w:jc w:val="both"/>
-        <w:rPr>
-          <w:rFonts w:ascii="Calibri" w:hAnsi="Calibri" w:cs="Calibri"/>
-          <w:sz w:val="36"/>
-          <w:szCs w:val="36"/>
-        </w:rPr>
-      </w:pPr>
-    </w:p>
-    <w:p>
-      <w:pPr>
-        <w:jc w:val="both"/>
-        <w:rPr>
-          <w:rFonts w:ascii="Calibri" w:hAnsi="Calibri" w:cs="Calibri"/>
-          <w:sz w:val="36"/>
-          <w:szCs w:val="36"/>
-        </w:rPr>
-      </w:pPr>
-      <w:r>
-        <w:rPr>
-          <w:rFonts w:ascii="Calibri" w:hAnsi="Calibri" w:cs="Calibri"/>
-          <w:sz w:val="36"/>
-          <w:szCs w:val="36"/>
-        </w:rPr>
-        <w:t>Using Lambda with map() Function:</w:t>
+        <w:t xml:space="preserve">add = lambda a, </w:t>
+      </w:r>
+      <w:proofErr w:type="gramStart"/>
+      <w:r>
+        <w:rPr>
+          <w:rFonts w:ascii="Calibri" w:hAnsi="Calibri" w:cs="Calibri"/>
+          <w:b/>
+          <w:bCs/>
+          <w:color w:val="D86DCB" w:themeColor="accent5" w:themeTint="99"/>
+          <w:sz w:val="36"/>
+          <w:szCs w:val="36"/>
+        </w:rPr>
+        <w:t>b :</w:t>
+      </w:r>
+      <w:proofErr w:type="gramEnd"/>
+      <w:r>
+        <w:rPr>
+          <w:rFonts w:ascii="Calibri" w:hAnsi="Calibri" w:cs="Calibri"/>
+          <w:b/>
+          <w:bCs/>
+          <w:color w:val="D86DCB" w:themeColor="accent5" w:themeTint="99"/>
+          <w:sz w:val="36"/>
+          <w:szCs w:val="36"/>
+        </w:rPr>
+        <w:t xml:space="preserve"> a + b</w:t>
+      </w:r>
+    </w:p>
+    <w:p>
+      <w:pPr>
+        <w:jc w:val="both"/>
+        <w:rPr>
+          <w:rFonts w:ascii="Calibri" w:hAnsi="Calibri" w:cs="Calibri"/>
+          <w:b/>
+          <w:bCs/>
+          <w:color w:val="D86DCB" w:themeColor="accent5" w:themeTint="99"/>
+          <w:sz w:val="36"/>
+          <w:szCs w:val="36"/>
+        </w:rPr>
+      </w:pPr>
+      <w:proofErr w:type="gramStart"/>
+      <w:r>
+        <w:rPr>
+          <w:rFonts w:ascii="Calibri" w:hAnsi="Calibri" w:cs="Calibri"/>
+          <w:b/>
+          <w:bCs/>
+          <w:color w:val="D86DCB" w:themeColor="accent5" w:themeTint="99"/>
+          <w:sz w:val="36"/>
+          <w:szCs w:val="36"/>
+        </w:rPr>
+        <w:t>print(</w:t>
+      </w:r>
+      <w:proofErr w:type="gramEnd"/>
+      <w:r>
+        <w:rPr>
+          <w:rFonts w:ascii="Calibri" w:hAnsi="Calibri" w:cs="Calibri"/>
+          <w:b/>
+          <w:bCs/>
+          <w:color w:val="D86DCB" w:themeColor="accent5" w:themeTint="99"/>
+          <w:sz w:val="36"/>
+          <w:szCs w:val="36"/>
+        </w:rPr>
+        <w:t>add(10 ,20)) # 30</w:t>
+      </w:r>
+    </w:p>
+    <w:p>
+      <w:pPr>
+        <w:jc w:val="both"/>
+        <w:rPr>
+          <w:rFonts w:ascii="Calibri" w:hAnsi="Calibri" w:cs="Calibri"/>
+          <w:sz w:val="36"/>
+          <w:szCs w:val="36"/>
+        </w:rPr>
+      </w:pPr>
+    </w:p>
+    <w:p>
+      <w:pPr>
+        <w:jc w:val="both"/>
+        <w:rPr>
+          <w:rFonts w:ascii="Calibri" w:hAnsi="Calibri" w:cs="Calibri"/>
+          <w:sz w:val="36"/>
+          <w:szCs w:val="36"/>
+        </w:rPr>
+      </w:pPr>
+      <w:r>
+        <w:rPr>
+          <w:rFonts w:ascii="Calibri" w:hAnsi="Calibri" w:cs="Calibri"/>
+          <w:sz w:val="36"/>
+          <w:szCs w:val="36"/>
+        </w:rPr>
+        <w:t xml:space="preserve">Using Lambda with </w:t>
+      </w:r>
+      <w:proofErr w:type="gramStart"/>
+      <w:r>
+        <w:rPr>
+          <w:rFonts w:ascii="Calibri" w:hAnsi="Calibri" w:cs="Calibri"/>
+          <w:sz w:val="36"/>
+          <w:szCs w:val="36"/>
+        </w:rPr>
+        <w:t>map(</w:t>
+      </w:r>
+      <w:proofErr w:type="gramEnd"/>
+      <w:r>
+        <w:rPr>
+          <w:rFonts w:ascii="Calibri" w:hAnsi="Calibri" w:cs="Calibri"/>
+          <w:sz w:val="36"/>
+          <w:szCs w:val="36"/>
+        </w:rPr>
+        <w:t>) Function:</w:t>
       </w:r>
     </w:p>
     <w:p>
@@ -765,7 +914,31 @@
           <w:sz w:val="36"/>
           <w:szCs w:val="36"/>
         </w:rPr>
-        <w:t>result = list(map(double, numbers))</w:t>
+        <w:t xml:space="preserve">result = </w:t>
+      </w:r>
+      <w:proofErr w:type="gramStart"/>
+      <w:r>
+        <w:rPr>
+          <w:rFonts w:ascii="Calibri" w:hAnsi="Calibri" w:cs="Calibri"/>
+          <w:b/>
+          <w:bCs/>
+          <w:color w:val="D86DCB" w:themeColor="accent5" w:themeTint="99"/>
+          <w:sz w:val="36"/>
+          <w:szCs w:val="36"/>
+        </w:rPr>
+        <w:t>list(</w:t>
+      </w:r>
+      <w:proofErr w:type="gramEnd"/>
+      <w:r>
+        <w:rPr>
+          <w:rFonts w:ascii="Calibri" w:hAnsi="Calibri" w:cs="Calibri"/>
+          <w:b/>
+          <w:bCs/>
+          <w:color w:val="D86DCB" w:themeColor="accent5" w:themeTint="99"/>
+          <w:sz w:val="36"/>
+          <w:szCs w:val="36"/>
+        </w:rPr>
+        <w:t>map(double, numbers))</w:t>
       </w:r>
     </w:p>
     <w:p>
@@ -865,7 +1038,31 @@
           <w:sz w:val="36"/>
           <w:szCs w:val="36"/>
         </w:rPr>
-        <w:t>result = list(map(lambda x: x * 2, numbers))</w:t>
+        <w:t xml:space="preserve">result = </w:t>
+      </w:r>
+      <w:proofErr w:type="gramStart"/>
+      <w:r>
+        <w:rPr>
+          <w:rFonts w:ascii="Calibri" w:hAnsi="Calibri" w:cs="Calibri"/>
+          <w:b/>
+          <w:bCs/>
+          <w:color w:val="D86DCB" w:themeColor="accent5" w:themeTint="99"/>
+          <w:sz w:val="36"/>
+          <w:szCs w:val="36"/>
+        </w:rPr>
+        <w:t>list(</w:t>
+      </w:r>
+      <w:proofErr w:type="gramEnd"/>
+      <w:r>
+        <w:rPr>
+          <w:rFonts w:ascii="Calibri" w:hAnsi="Calibri" w:cs="Calibri"/>
+          <w:b/>
+          <w:bCs/>
+          <w:color w:val="D86DCB" w:themeColor="accent5" w:themeTint="99"/>
+          <w:sz w:val="36"/>
+          <w:szCs w:val="36"/>
+        </w:rPr>
+        <w:t>map(lambda x: x * 2, numbers))</w:t>
       </w:r>
     </w:p>
     <w:p>
@@ -917,7 +1114,25 @@
           <w:sz w:val="36"/>
           <w:szCs w:val="36"/>
         </w:rPr>
-        <w:t>Using Lambda with sorted():</w:t>
+        <w:t xml:space="preserve">Using Lambda with </w:t>
+      </w:r>
+      <w:proofErr w:type="gramStart"/>
+      <w:r>
+        <w:rPr>
+          <w:rFonts w:ascii="Calibri" w:hAnsi="Calibri" w:cs="Calibri"/>
+          <w:sz w:val="36"/>
+          <w:szCs w:val="36"/>
+        </w:rPr>
+        <w:t>sorted(</w:t>
+      </w:r>
+      <w:proofErr w:type="gramEnd"/>
+      <w:r>
+        <w:rPr>
+          <w:rFonts w:ascii="Calibri" w:hAnsi="Calibri" w:cs="Calibri"/>
+          <w:sz w:val="36"/>
+          <w:szCs w:val="36"/>
+        </w:rPr>
+        <w:t>):</w:t>
       </w:r>
     </w:p>
     <w:p>
@@ -1084,7 +1299,29 @@
           <w:sz w:val="36"/>
           <w:szCs w:val="36"/>
         </w:rPr>
-        <w:t>lambda student: student[1]</w:t>
+        <w:t xml:space="preserve">lambda student: </w:t>
+      </w:r>
+      <w:proofErr w:type="gramStart"/>
+      <w:r>
+        <w:rPr>
+          <w:rFonts w:ascii="Calibri" w:hAnsi="Calibri" w:cs="Calibri"/>
+          <w:b/>
+          <w:bCs/>
+          <w:sz w:val="36"/>
+          <w:szCs w:val="36"/>
+        </w:rPr>
+        <w:t>student[</w:t>
+      </w:r>
+      <w:proofErr w:type="gramEnd"/>
+      <w:r>
+        <w:rPr>
+          <w:rFonts w:ascii="Calibri" w:hAnsi="Calibri" w:cs="Calibri"/>
+          <w:b/>
+          <w:bCs/>
+          <w:sz w:val="36"/>
+          <w:szCs w:val="36"/>
+        </w:rPr>
+        <w:t>1]</w:t>
       </w:r>
       <w:r>
         <w:rPr>
@@ -1116,7 +1353,31 @@
           <w:sz w:val="36"/>
           <w:szCs w:val="36"/>
         </w:rPr>
-        <w:t>students = sorted(students, key=lambda student: student[1])</w:t>
+        <w:t xml:space="preserve">students = </w:t>
+      </w:r>
+      <w:proofErr w:type="gramStart"/>
+      <w:r>
+        <w:rPr>
+          <w:rFonts w:ascii="Calibri" w:hAnsi="Calibri" w:cs="Calibri"/>
+          <w:b/>
+          <w:bCs/>
+          <w:color w:val="D86DCB" w:themeColor="accent5" w:themeTint="99"/>
+          <w:sz w:val="36"/>
+          <w:szCs w:val="36"/>
+        </w:rPr>
+        <w:t>sorted(</w:t>
+      </w:r>
+      <w:proofErr w:type="gramEnd"/>
+      <w:r>
+        <w:rPr>
+          <w:rFonts w:ascii="Calibri" w:hAnsi="Calibri" w:cs="Calibri"/>
+          <w:b/>
+          <w:bCs/>
+          <w:color w:val="D86DCB" w:themeColor="accent5" w:themeTint="99"/>
+          <w:sz w:val="36"/>
+          <w:szCs w:val="36"/>
+        </w:rPr>
+        <w:t>students, key=lambda student: student[1])</w:t>
       </w:r>
     </w:p>
     <w:p>
@@ -1257,15 +1518,27 @@
         </w:rPr>
         <w:t xml:space="preserve">We're passing a function to another function like </w:t>
       </w:r>
-      <w:r>
-        <w:rPr>
-          <w:rFonts w:ascii="Calibri" w:hAnsi="Calibri" w:cs="Calibri"/>
-          <w:b/>
-          <w:bCs/>
-          <w:sz w:val="36"/>
-          <w:szCs w:val="36"/>
-        </w:rPr>
-        <w:t>map()</w:t>
+      <w:proofErr w:type="gramStart"/>
+      <w:r>
+        <w:rPr>
+          <w:rFonts w:ascii="Calibri" w:hAnsi="Calibri" w:cs="Calibri"/>
+          <w:b/>
+          <w:bCs/>
+          <w:sz w:val="36"/>
+          <w:szCs w:val="36"/>
+        </w:rPr>
+        <w:t>map(</w:t>
+      </w:r>
+      <w:proofErr w:type="gramEnd"/>
+      <w:r>
+        <w:rPr>
+          <w:rFonts w:ascii="Calibri" w:hAnsi="Calibri" w:cs="Calibri"/>
+          <w:b/>
+          <w:bCs/>
+          <w:sz w:val="36"/>
+          <w:szCs w:val="36"/>
+        </w:rPr>
+        <w:t>)</w:t>
       </w:r>
       <w:r>
         <w:rPr>
@@ -1473,7 +1746,25 @@
                 <w:sz w:val="36"/>
                 <w:szCs w:val="36"/>
               </w:rPr>
-              <w:t>Anonymous (lambda)</w:t>
+              <w:t>Anonymous (</w:t>
+            </w:r>
+            <w:r>
+              <w:rPr>
+                <w:rFonts w:ascii="Calibri" w:hAnsi="Calibri" w:cs="Calibri"/>
+                <w:b/>
+                <w:bCs/>
+                <w:sz w:val="36"/>
+                <w:szCs w:val="36"/>
+              </w:rPr>
+              <w:t>lambda</w:t>
+            </w:r>
+            <w:r>
+              <w:rPr>
+                <w:rFonts w:ascii="Calibri" w:hAnsi="Calibri" w:cs="Calibri"/>
+                <w:sz w:val="36"/>
+                <w:szCs w:val="36"/>
+              </w:rPr>
+              <w:t>)</w:t>
             </w:r>
           </w:p>
         </w:tc>
@@ -1777,8 +2068,20 @@
           <w:sz w:val="36"/>
           <w:szCs w:val="36"/>
         </w:rPr>
-        <w:t xml:space="preserve"> VoidCallback</w:t>
-      </w:r>
+        <w:t xml:space="preserve"> </w:t>
+      </w:r>
+      <w:proofErr w:type="spellStart"/>
+      <w:r>
+        <w:rPr>
+          <w:rFonts w:ascii="Calibri" w:hAnsi="Calibri" w:cs="Calibri"/>
+          <w:b/>
+          <w:bCs/>
+          <w:sz w:val="36"/>
+          <w:szCs w:val="36"/>
+        </w:rPr>
+        <w:t>VoidCallback</w:t>
+      </w:r>
+      <w:proofErr w:type="spellEnd"/>
       <w:r>
         <w:rPr>
           <w:rFonts w:ascii="Calibri" w:hAnsi="Calibri" w:cs="Calibri"/>
@@ -1920,6 +2223,54 @@
         </w:rPr>
         <w:t xml:space="preserve"># Here </w:t>
       </w:r>
+      <w:proofErr w:type="gramStart"/>
+      <w:r>
+        <w:rPr>
+          <w:rFonts w:ascii="Calibri" w:hAnsi="Calibri" w:cs="Calibri"/>
+          <w:b/>
+          <w:bCs/>
+          <w:sz w:val="36"/>
+          <w:szCs w:val="36"/>
+        </w:rPr>
+        <w:t>greet(</w:t>
+      </w:r>
+      <w:proofErr w:type="gramEnd"/>
+      <w:r>
+        <w:rPr>
+          <w:rFonts w:ascii="Calibri" w:hAnsi="Calibri" w:cs="Calibri"/>
+          <w:b/>
+          <w:bCs/>
+          <w:sz w:val="36"/>
+          <w:szCs w:val="36"/>
+        </w:rPr>
+        <w:t>)</w:t>
+      </w:r>
+      <w:r>
+        <w:rPr>
+          <w:rFonts w:ascii="Calibri" w:hAnsi="Calibri" w:cs="Calibri"/>
+          <w:sz w:val="36"/>
+          <w:szCs w:val="36"/>
+        </w:rPr>
+        <w:t xml:space="preserve"> function takes the </w:t>
+      </w:r>
+      <w:r>
+        <w:rPr>
+          <w:rFonts w:ascii="Calibri" w:hAnsi="Calibri" w:cs="Calibri"/>
+          <w:b/>
+          <w:bCs/>
+          <w:sz w:val="36"/>
+          <w:szCs w:val="36"/>
+        </w:rPr>
+        <w:t>done</w:t>
+      </w:r>
+      <w:r>
+        <w:rPr>
+          <w:rFonts w:ascii="Calibri" w:hAnsi="Calibri" w:cs="Calibri"/>
+          <w:sz w:val="36"/>
+          <w:szCs w:val="36"/>
+        </w:rPr>
+        <w:t xml:space="preserve"> function itself as a parameter and can be called in the </w:t>
+      </w:r>
       <w:r>
         <w:rPr>
           <w:rFonts w:ascii="Calibri" w:hAnsi="Calibri" w:cs="Calibri"/>
@@ -1936,42 +2287,6 @@
           <w:sz w:val="36"/>
           <w:szCs w:val="36"/>
         </w:rPr>
-        <w:t xml:space="preserve"> function takes the </w:t>
-      </w:r>
-      <w:r>
-        <w:rPr>
-          <w:rFonts w:ascii="Calibri" w:hAnsi="Calibri" w:cs="Calibri"/>
-          <w:b/>
-          <w:bCs/>
-          <w:sz w:val="36"/>
-          <w:szCs w:val="36"/>
-        </w:rPr>
-        <w:t>done</w:t>
-      </w:r>
-      <w:r>
-        <w:rPr>
-          <w:rFonts w:ascii="Calibri" w:hAnsi="Calibri" w:cs="Calibri"/>
-          <w:sz w:val="36"/>
-          <w:szCs w:val="36"/>
-        </w:rPr>
-        <w:t xml:space="preserve"> function itself as a parameter and can be called in the </w:t>
-      </w:r>
-      <w:r>
-        <w:rPr>
-          <w:rFonts w:ascii="Calibri" w:hAnsi="Calibri" w:cs="Calibri"/>
-          <w:b/>
-          <w:bCs/>
-          <w:sz w:val="36"/>
-          <w:szCs w:val="36"/>
-        </w:rPr>
-        <w:t>greet()</w:t>
-      </w:r>
-      <w:r>
-        <w:rPr>
-          <w:rFonts w:ascii="Calibri" w:hAnsi="Calibri" w:cs="Calibri"/>
-          <w:sz w:val="36"/>
-          <w:szCs w:val="36"/>
-        </w:rPr>
         <w:t xml:space="preserve"> function</w:t>
       </w:r>
     </w:p>
@@ -2044,31 +2359,79 @@
           <w:sz w:val="36"/>
           <w:szCs w:val="36"/>
         </w:rPr>
-        <w:t xml:space="preserve">    callback()</w:t>
-      </w:r>
-    </w:p>
-    <w:p>
-      <w:pPr>
-        <w:jc w:val="both"/>
-        <w:rPr>
-          <w:rFonts w:ascii="Calibri" w:hAnsi="Calibri" w:cs="Calibri"/>
-          <w:b/>
-          <w:bCs/>
-          <w:color w:val="D86DCB" w:themeColor="accent5" w:themeTint="99"/>
-          <w:sz w:val="36"/>
-          <w:szCs w:val="36"/>
-        </w:rPr>
-      </w:pPr>
-      <w:r>
-        <w:rPr>
-          <w:rFonts w:ascii="Calibri" w:hAnsi="Calibri" w:cs="Calibri"/>
-          <w:b/>
-          <w:bCs/>
-          <w:color w:val="D86DCB" w:themeColor="accent5" w:themeTint="99"/>
-          <w:sz w:val="36"/>
-          <w:szCs w:val="36"/>
-        </w:rPr>
-        <w:t>def done():</w:t>
+        <w:t xml:space="preserve">    </w:t>
+      </w:r>
+      <w:proofErr w:type="gramStart"/>
+      <w:r>
+        <w:rPr>
+          <w:rFonts w:ascii="Calibri" w:hAnsi="Calibri" w:cs="Calibri"/>
+          <w:b/>
+          <w:bCs/>
+          <w:color w:val="D86DCB" w:themeColor="accent5" w:themeTint="99"/>
+          <w:sz w:val="36"/>
+          <w:szCs w:val="36"/>
+        </w:rPr>
+        <w:t>callback(</w:t>
+      </w:r>
+      <w:proofErr w:type="gramEnd"/>
+      <w:r>
+        <w:rPr>
+          <w:rFonts w:ascii="Calibri" w:hAnsi="Calibri" w:cs="Calibri"/>
+          <w:b/>
+          <w:bCs/>
+          <w:color w:val="D86DCB" w:themeColor="accent5" w:themeTint="99"/>
+          <w:sz w:val="36"/>
+          <w:szCs w:val="36"/>
+        </w:rPr>
+        <w:t>)</w:t>
+      </w:r>
+    </w:p>
+    <w:p>
+      <w:pPr>
+        <w:jc w:val="both"/>
+        <w:rPr>
+          <w:rFonts w:ascii="Calibri" w:hAnsi="Calibri" w:cs="Calibri"/>
+          <w:b/>
+          <w:bCs/>
+          <w:color w:val="D86DCB" w:themeColor="accent5" w:themeTint="99"/>
+          <w:sz w:val="36"/>
+          <w:szCs w:val="36"/>
+        </w:rPr>
+      </w:pPr>
+      <w:r>
+        <w:rPr>
+          <w:rFonts w:ascii="Calibri" w:hAnsi="Calibri" w:cs="Calibri"/>
+          <w:b/>
+          <w:bCs/>
+          <w:color w:val="D86DCB" w:themeColor="accent5" w:themeTint="99"/>
+          <w:sz w:val="36"/>
+          <w:szCs w:val="36"/>
+        </w:rPr>
+        <w:t xml:space="preserve">def </w:t>
+      </w:r>
+      <w:proofErr w:type="gramStart"/>
+      <w:r>
+        <w:rPr>
+          <w:rFonts w:ascii="Calibri" w:hAnsi="Calibri" w:cs="Calibri"/>
+          <w:b/>
+          <w:bCs/>
+          <w:color w:val="D86DCB" w:themeColor="accent5" w:themeTint="99"/>
+          <w:sz w:val="36"/>
+          <w:szCs w:val="36"/>
+        </w:rPr>
+        <w:t>done(</w:t>
+      </w:r>
+      <w:proofErr w:type="gramEnd"/>
+      <w:r>
+        <w:rPr>
+          <w:rFonts w:ascii="Calibri" w:hAnsi="Calibri" w:cs="Calibri"/>
+          <w:b/>
+          <w:bCs/>
+          <w:color w:val="D86DCB" w:themeColor="accent5" w:themeTint="99"/>
+          <w:sz w:val="36"/>
+          <w:szCs w:val="36"/>
+        </w:rPr>
+        <w:t>):</w:t>
       </w:r>
     </w:p>
     <w:p>
@@ -2319,7 +2682,31 @@
           <w:sz w:val="36"/>
           <w:szCs w:val="36"/>
         </w:rPr>
-        <w:t xml:space="preserve">    callback()</w:t>
+        <w:t xml:space="preserve">    </w:t>
+      </w:r>
+      <w:proofErr w:type="gramStart"/>
+      <w:r>
+        <w:rPr>
+          <w:rFonts w:ascii="Calibri" w:hAnsi="Calibri" w:cs="Calibri"/>
+          <w:b/>
+          <w:bCs/>
+          <w:color w:val="D86DCB" w:themeColor="accent5" w:themeTint="99"/>
+          <w:sz w:val="36"/>
+          <w:szCs w:val="36"/>
+        </w:rPr>
+        <w:t>callback(</w:t>
+      </w:r>
+      <w:proofErr w:type="gramEnd"/>
+      <w:r>
+        <w:rPr>
+          <w:rFonts w:ascii="Calibri" w:hAnsi="Calibri" w:cs="Calibri"/>
+          <w:b/>
+          <w:bCs/>
+          <w:color w:val="D86DCB" w:themeColor="accent5" w:themeTint="99"/>
+          <w:sz w:val="36"/>
+          <w:szCs w:val="36"/>
+        </w:rPr>
+        <w:t>)</w:t>
       </w:r>
     </w:p>
     <w:p>
@@ -2388,16 +2775,29 @@
           <w:szCs w:val="36"/>
         </w:rPr>
       </w:pPr>
-      <w:r>
-        <w:rPr>
-          <w:rFonts w:ascii="Calibri" w:hAnsi="Calibri" w:cs="Calibri"/>
-          <w:b/>
-          <w:bCs/>
-          <w:color w:val="D86DCB" w:themeColor="accent5" w:themeTint="99"/>
-          <w:sz w:val="36"/>
-          <w:szCs w:val="36"/>
-        </w:rPr>
-        <w:t>greet(lambda : print("Done"))</w:t>
+      <w:proofErr w:type="gramStart"/>
+      <w:r>
+        <w:rPr>
+          <w:rFonts w:ascii="Calibri" w:hAnsi="Calibri" w:cs="Calibri"/>
+          <w:b/>
+          <w:bCs/>
+          <w:color w:val="D86DCB" w:themeColor="accent5" w:themeTint="99"/>
+          <w:sz w:val="36"/>
+          <w:szCs w:val="36"/>
+        </w:rPr>
+        <w:t>greet(</w:t>
+      </w:r>
+      <w:proofErr w:type="gramEnd"/>
+      <w:r>
+        <w:rPr>
+          <w:rFonts w:ascii="Calibri" w:hAnsi="Calibri" w:cs="Calibri"/>
+          <w:b/>
+          <w:bCs/>
+          <w:color w:val="D86DCB" w:themeColor="accent5" w:themeTint="99"/>
+          <w:sz w:val="36"/>
+          <w:szCs w:val="36"/>
+        </w:rPr>
+        <w:t>lambda : print("Done"))</w:t>
       </w:r>
     </w:p>
     <w:p>
@@ -2529,55 +2929,127 @@
           <w:sz w:val="36"/>
           <w:szCs w:val="36"/>
         </w:rPr>
-        <w:t>def calculate(a, b, operation):</w:t>
-      </w:r>
-    </w:p>
-    <w:p>
-      <w:pPr>
-        <w:jc w:val="both"/>
-        <w:rPr>
-          <w:rFonts w:ascii="Calibri" w:hAnsi="Calibri" w:cs="Calibri"/>
-          <w:b/>
-          <w:bCs/>
-          <w:color w:val="D86DCB" w:themeColor="accent5" w:themeTint="99"/>
-          <w:sz w:val="36"/>
-          <w:szCs w:val="36"/>
-        </w:rPr>
-      </w:pPr>
-      <w:r>
-        <w:rPr>
-          <w:rFonts w:ascii="Calibri" w:hAnsi="Calibri" w:cs="Calibri"/>
-          <w:b/>
-          <w:bCs/>
-          <w:color w:val="D86DCB" w:themeColor="accent5" w:themeTint="99"/>
-          <w:sz w:val="36"/>
-          <w:szCs w:val="36"/>
-        </w:rPr>
-        <w:t xml:space="preserve">    return operation(a, b)</w:t>
-      </w:r>
-    </w:p>
-    <w:p>
-      <w:pPr>
-        <w:jc w:val="both"/>
-        <w:rPr>
-          <w:rFonts w:ascii="Calibri" w:hAnsi="Calibri" w:cs="Calibri"/>
-          <w:b/>
-          <w:bCs/>
-          <w:color w:val="D86DCB" w:themeColor="accent5" w:themeTint="99"/>
-          <w:sz w:val="36"/>
-          <w:szCs w:val="36"/>
-        </w:rPr>
-      </w:pPr>
-      <w:r>
-        <w:rPr>
-          <w:rFonts w:ascii="Calibri" w:hAnsi="Calibri" w:cs="Calibri"/>
-          <w:b/>
-          <w:bCs/>
-          <w:color w:val="D86DCB" w:themeColor="accent5" w:themeTint="99"/>
-          <w:sz w:val="36"/>
-          <w:szCs w:val="36"/>
-        </w:rPr>
-        <w:t>result = calculate(10, 20, lambda x, y: x + y)</w:t>
+        <w:t xml:space="preserve">def </w:t>
+      </w:r>
+      <w:proofErr w:type="gramStart"/>
+      <w:r>
+        <w:rPr>
+          <w:rFonts w:ascii="Calibri" w:hAnsi="Calibri" w:cs="Calibri"/>
+          <w:b/>
+          <w:bCs/>
+          <w:color w:val="D86DCB" w:themeColor="accent5" w:themeTint="99"/>
+          <w:sz w:val="36"/>
+          <w:szCs w:val="36"/>
+        </w:rPr>
+        <w:t>calculate(</w:t>
+      </w:r>
+      <w:proofErr w:type="gramEnd"/>
+      <w:r>
+        <w:rPr>
+          <w:rFonts w:ascii="Calibri" w:hAnsi="Calibri" w:cs="Calibri"/>
+          <w:b/>
+          <w:bCs/>
+          <w:color w:val="D86DCB" w:themeColor="accent5" w:themeTint="99"/>
+          <w:sz w:val="36"/>
+          <w:szCs w:val="36"/>
+        </w:rPr>
+        <w:t>a, b, operation):</w:t>
+      </w:r>
+    </w:p>
+    <w:p>
+      <w:pPr>
+        <w:jc w:val="both"/>
+        <w:rPr>
+          <w:rFonts w:ascii="Calibri" w:hAnsi="Calibri" w:cs="Calibri"/>
+          <w:b/>
+          <w:bCs/>
+          <w:color w:val="D86DCB" w:themeColor="accent5" w:themeTint="99"/>
+          <w:sz w:val="36"/>
+          <w:szCs w:val="36"/>
+        </w:rPr>
+      </w:pPr>
+      <w:r>
+        <w:rPr>
+          <w:rFonts w:ascii="Calibri" w:hAnsi="Calibri" w:cs="Calibri"/>
+          <w:b/>
+          <w:bCs/>
+          <w:color w:val="D86DCB" w:themeColor="accent5" w:themeTint="99"/>
+          <w:sz w:val="36"/>
+          <w:szCs w:val="36"/>
+        </w:rPr>
+        <w:t xml:space="preserve">    return </w:t>
+      </w:r>
+      <w:proofErr w:type="gramStart"/>
+      <w:r>
+        <w:rPr>
+          <w:rFonts w:ascii="Calibri" w:hAnsi="Calibri" w:cs="Calibri"/>
+          <w:b/>
+          <w:bCs/>
+          <w:color w:val="D86DCB" w:themeColor="accent5" w:themeTint="99"/>
+          <w:sz w:val="36"/>
+          <w:szCs w:val="36"/>
+        </w:rPr>
+        <w:t>operation(</w:t>
+      </w:r>
+      <w:proofErr w:type="gramEnd"/>
+      <w:r>
+        <w:rPr>
+          <w:rFonts w:ascii="Calibri" w:hAnsi="Calibri" w:cs="Calibri"/>
+          <w:b/>
+          <w:bCs/>
+          <w:color w:val="D86DCB" w:themeColor="accent5" w:themeTint="99"/>
+          <w:sz w:val="36"/>
+          <w:szCs w:val="36"/>
+        </w:rPr>
+        <w:t>a, b)</w:t>
+      </w:r>
+    </w:p>
+    <w:p>
+      <w:pPr>
+        <w:jc w:val="both"/>
+        <w:rPr>
+          <w:rFonts w:ascii="Calibri" w:hAnsi="Calibri" w:cs="Calibri"/>
+          <w:b/>
+          <w:bCs/>
+          <w:color w:val="D86DCB" w:themeColor="accent5" w:themeTint="99"/>
+          <w:sz w:val="36"/>
+          <w:szCs w:val="36"/>
+        </w:rPr>
+      </w:pPr>
+      <w:r>
+        <w:rPr>
+          <w:rFonts w:ascii="Calibri" w:hAnsi="Calibri" w:cs="Calibri"/>
+          <w:b/>
+          <w:bCs/>
+          <w:color w:val="D86DCB" w:themeColor="accent5" w:themeTint="99"/>
+          <w:sz w:val="36"/>
+          <w:szCs w:val="36"/>
+        </w:rPr>
+        <w:t xml:space="preserve">result = </w:t>
+      </w:r>
+      <w:proofErr w:type="gramStart"/>
+      <w:r>
+        <w:rPr>
+          <w:rFonts w:ascii="Calibri" w:hAnsi="Calibri" w:cs="Calibri"/>
+          <w:b/>
+          <w:bCs/>
+          <w:color w:val="D86DCB" w:themeColor="accent5" w:themeTint="99"/>
+          <w:sz w:val="36"/>
+          <w:szCs w:val="36"/>
+        </w:rPr>
+        <w:t>calculate(</w:t>
+      </w:r>
+      <w:proofErr w:type="gramEnd"/>
+      <w:r>
+        <w:rPr>
+          <w:rFonts w:ascii="Calibri" w:hAnsi="Calibri" w:cs="Calibri"/>
+          <w:b/>
+          <w:bCs/>
+          <w:color w:val="D86DCB" w:themeColor="accent5" w:themeTint="99"/>
+          <w:sz w:val="36"/>
+          <w:szCs w:val="36"/>
+        </w:rPr>
+        <w:t>10, 20, lambda x, y: x + y)</w:t>
       </w:r>
     </w:p>
     <w:p>
@@ -2678,15 +3150,27 @@
         </w:rPr>
         <w:t xml:space="preserve"># </w:t>
       </w:r>
-      <w:r>
-        <w:rPr>
-          <w:rFonts w:ascii="Calibri" w:hAnsi="Calibri" w:cs="Calibri"/>
-          <w:b/>
-          <w:bCs/>
-          <w:sz w:val="36"/>
-          <w:szCs w:val="36"/>
-        </w:rPr>
-        <w:t>Callable[[], None]</w:t>
+      <w:proofErr w:type="gramStart"/>
+      <w:r>
+        <w:rPr>
+          <w:rFonts w:ascii="Calibri" w:hAnsi="Calibri" w:cs="Calibri"/>
+          <w:b/>
+          <w:bCs/>
+          <w:sz w:val="36"/>
+          <w:szCs w:val="36"/>
+        </w:rPr>
+        <w:t>Callable[</w:t>
+      </w:r>
+      <w:proofErr w:type="gramEnd"/>
+      <w:r>
+        <w:rPr>
+          <w:rFonts w:ascii="Calibri" w:hAnsi="Calibri" w:cs="Calibri"/>
+          <w:b/>
+          <w:bCs/>
+          <w:sz w:val="36"/>
+          <w:szCs w:val="36"/>
+        </w:rPr>
+        <w:t>[], None]</w:t>
       </w:r>
       <w:r>
         <w:rPr>
@@ -2806,8 +3290,20 @@
           <w:sz w:val="36"/>
           <w:szCs w:val="36"/>
         </w:rPr>
-        <w:t xml:space="preserve"> VoidCallback</w:t>
-      </w:r>
+        <w:t xml:space="preserve"> </w:t>
+      </w:r>
+      <w:proofErr w:type="spellStart"/>
+      <w:r>
+        <w:rPr>
+          <w:rFonts w:ascii="Calibri" w:hAnsi="Calibri" w:cs="Calibri"/>
+          <w:b/>
+          <w:bCs/>
+          <w:sz w:val="36"/>
+          <w:szCs w:val="36"/>
+        </w:rPr>
+        <w:t>VoidCallback</w:t>
+      </w:r>
+      <w:proofErr w:type="spellEnd"/>
       <w:r>
         <w:rPr>
           <w:rFonts w:ascii="Calibri" w:hAnsi="Calibri" w:cs="Calibri"/>
@@ -2862,7 +3358,31 @@
           <w:sz w:val="36"/>
           <w:szCs w:val="36"/>
         </w:rPr>
-        <w:t>def greet(callback: Callable[[], None]):</w:t>
+        <w:t xml:space="preserve">def </w:t>
+      </w:r>
+      <w:proofErr w:type="gramStart"/>
+      <w:r>
+        <w:rPr>
+          <w:rFonts w:ascii="Calibri" w:hAnsi="Calibri" w:cs="Calibri"/>
+          <w:b/>
+          <w:bCs/>
+          <w:color w:val="D86DCB" w:themeColor="accent5" w:themeTint="99"/>
+          <w:sz w:val="36"/>
+          <w:szCs w:val="36"/>
+        </w:rPr>
+        <w:t>greet(</w:t>
+      </w:r>
+      <w:proofErr w:type="gramEnd"/>
+      <w:r>
+        <w:rPr>
+          <w:rFonts w:ascii="Calibri" w:hAnsi="Calibri" w:cs="Calibri"/>
+          <w:b/>
+          <w:bCs/>
+          <w:color w:val="D86DCB" w:themeColor="accent5" w:themeTint="99"/>
+          <w:sz w:val="36"/>
+          <w:szCs w:val="36"/>
+        </w:rPr>
+        <w:t>callback: Callable[[], None]):</w:t>
       </w:r>
     </w:p>
     <w:p>
@@ -2910,31 +3430,68 @@
           <w:sz w:val="36"/>
           <w:szCs w:val="36"/>
         </w:rPr>
-        <w:t xml:space="preserve">    callback()</w:t>
-      </w:r>
-    </w:p>
-    <w:p>
-      <w:pPr>
-        <w:jc w:val="both"/>
-        <w:rPr>
-          <w:rFonts w:ascii="Calibri" w:hAnsi="Calibri" w:cs="Calibri"/>
-          <w:b/>
-          <w:bCs/>
-          <w:color w:val="D86DCB" w:themeColor="accent5" w:themeTint="99"/>
-          <w:sz w:val="36"/>
-          <w:szCs w:val="36"/>
-        </w:rPr>
-      </w:pPr>
-      <w:r>
-        <w:rPr>
-          <w:rFonts w:ascii="Calibri" w:hAnsi="Calibri" w:cs="Calibri"/>
-          <w:b/>
-          <w:bCs/>
-          <w:color w:val="D86DCB" w:themeColor="accent5" w:themeTint="99"/>
-          <w:sz w:val="36"/>
-          <w:szCs w:val="36"/>
-        </w:rPr>
-        <w:t>greet(callback=lambda : print("Done"))</w:t>
+        <w:t xml:space="preserve">    </w:t>
+      </w:r>
+      <w:proofErr w:type="gramStart"/>
+      <w:r>
+        <w:rPr>
+          <w:rFonts w:ascii="Calibri" w:hAnsi="Calibri" w:cs="Calibri"/>
+          <w:b/>
+          <w:bCs/>
+          <w:color w:val="D86DCB" w:themeColor="accent5" w:themeTint="99"/>
+          <w:sz w:val="36"/>
+          <w:szCs w:val="36"/>
+        </w:rPr>
+        <w:t>callback(</w:t>
+      </w:r>
+      <w:proofErr w:type="gramEnd"/>
+      <w:r>
+        <w:rPr>
+          <w:rFonts w:ascii="Calibri" w:hAnsi="Calibri" w:cs="Calibri"/>
+          <w:b/>
+          <w:bCs/>
+          <w:color w:val="D86DCB" w:themeColor="accent5" w:themeTint="99"/>
+          <w:sz w:val="36"/>
+          <w:szCs w:val="36"/>
+        </w:rPr>
+        <w:t>)</w:t>
+      </w:r>
+    </w:p>
+    <w:p>
+      <w:pPr>
+        <w:jc w:val="both"/>
+        <w:rPr>
+          <w:rFonts w:ascii="Calibri" w:hAnsi="Calibri" w:cs="Calibri"/>
+          <w:b/>
+          <w:bCs/>
+          <w:color w:val="D86DCB" w:themeColor="accent5" w:themeTint="99"/>
+          <w:sz w:val="36"/>
+          <w:szCs w:val="36"/>
+        </w:rPr>
+      </w:pPr>
+      <w:proofErr w:type="gramStart"/>
+      <w:r>
+        <w:rPr>
+          <w:rFonts w:ascii="Calibri" w:hAnsi="Calibri" w:cs="Calibri"/>
+          <w:b/>
+          <w:bCs/>
+          <w:color w:val="D86DCB" w:themeColor="accent5" w:themeTint="99"/>
+          <w:sz w:val="36"/>
+          <w:szCs w:val="36"/>
+        </w:rPr>
+        <w:t>greet(</w:t>
+      </w:r>
+      <w:proofErr w:type="gramEnd"/>
+      <w:r>
+        <w:rPr>
+          <w:rFonts w:ascii="Calibri" w:hAnsi="Calibri" w:cs="Calibri"/>
+          <w:b/>
+          <w:bCs/>
+          <w:color w:val="D86DCB" w:themeColor="accent5" w:themeTint="99"/>
+          <w:sz w:val="36"/>
+          <w:szCs w:val="36"/>
+        </w:rPr>
+        <w:t>callback=lambda : print("Done"))</w:t>
       </w:r>
     </w:p>
     <w:p>
@@ -3074,55 +3631,127 @@
           <w:sz w:val="36"/>
           <w:szCs w:val="36"/>
         </w:rPr>
-        <w:t>def calculate(operation: Callable[[int, int], int]):</w:t>
-      </w:r>
-    </w:p>
-    <w:p>
-      <w:pPr>
-        <w:jc w:val="both"/>
-        <w:rPr>
-          <w:rFonts w:ascii="Calibri" w:hAnsi="Calibri" w:cs="Calibri"/>
-          <w:b/>
-          <w:bCs/>
-          <w:color w:val="D86DCB" w:themeColor="accent5" w:themeTint="99"/>
-          <w:sz w:val="36"/>
-          <w:szCs w:val="36"/>
-        </w:rPr>
-      </w:pPr>
-      <w:r>
-        <w:rPr>
-          <w:rFonts w:ascii="Calibri" w:hAnsi="Calibri" w:cs="Calibri"/>
-          <w:b/>
-          <w:bCs/>
-          <w:color w:val="D86DCB" w:themeColor="accent5" w:themeTint="99"/>
-          <w:sz w:val="36"/>
-          <w:szCs w:val="36"/>
-        </w:rPr>
-        <w:t xml:space="preserve">    return operation(10, 20)</w:t>
-      </w:r>
-    </w:p>
-    <w:p>
-      <w:pPr>
-        <w:jc w:val="both"/>
-        <w:rPr>
-          <w:rFonts w:ascii="Calibri" w:hAnsi="Calibri" w:cs="Calibri"/>
-          <w:b/>
-          <w:bCs/>
-          <w:color w:val="D86DCB" w:themeColor="accent5" w:themeTint="99"/>
-          <w:sz w:val="36"/>
-          <w:szCs w:val="36"/>
-        </w:rPr>
-      </w:pPr>
-      <w:r>
-        <w:rPr>
-          <w:rFonts w:ascii="Calibri" w:hAnsi="Calibri" w:cs="Calibri"/>
-          <w:b/>
-          <w:bCs/>
-          <w:color w:val="D86DCB" w:themeColor="accent5" w:themeTint="99"/>
-          <w:sz w:val="36"/>
-          <w:szCs w:val="36"/>
-        </w:rPr>
-        <w:t>result = calculate(operation = lambda x, y : x + y)</w:t>
+        <w:t xml:space="preserve">def </w:t>
+      </w:r>
+      <w:proofErr w:type="gramStart"/>
+      <w:r>
+        <w:rPr>
+          <w:rFonts w:ascii="Calibri" w:hAnsi="Calibri" w:cs="Calibri"/>
+          <w:b/>
+          <w:bCs/>
+          <w:color w:val="D86DCB" w:themeColor="accent5" w:themeTint="99"/>
+          <w:sz w:val="36"/>
+          <w:szCs w:val="36"/>
+        </w:rPr>
+        <w:t>calculate(</w:t>
+      </w:r>
+      <w:proofErr w:type="gramEnd"/>
+      <w:r>
+        <w:rPr>
+          <w:rFonts w:ascii="Calibri" w:hAnsi="Calibri" w:cs="Calibri"/>
+          <w:b/>
+          <w:bCs/>
+          <w:color w:val="D86DCB" w:themeColor="accent5" w:themeTint="99"/>
+          <w:sz w:val="36"/>
+          <w:szCs w:val="36"/>
+        </w:rPr>
+        <w:t>operation: Callable[[int, int], int]):</w:t>
+      </w:r>
+    </w:p>
+    <w:p>
+      <w:pPr>
+        <w:jc w:val="both"/>
+        <w:rPr>
+          <w:rFonts w:ascii="Calibri" w:hAnsi="Calibri" w:cs="Calibri"/>
+          <w:b/>
+          <w:bCs/>
+          <w:color w:val="D86DCB" w:themeColor="accent5" w:themeTint="99"/>
+          <w:sz w:val="36"/>
+          <w:szCs w:val="36"/>
+        </w:rPr>
+      </w:pPr>
+      <w:r>
+        <w:rPr>
+          <w:rFonts w:ascii="Calibri" w:hAnsi="Calibri" w:cs="Calibri"/>
+          <w:b/>
+          <w:bCs/>
+          <w:color w:val="D86DCB" w:themeColor="accent5" w:themeTint="99"/>
+          <w:sz w:val="36"/>
+          <w:szCs w:val="36"/>
+        </w:rPr>
+        <w:t xml:space="preserve">    return </w:t>
+      </w:r>
+      <w:proofErr w:type="gramStart"/>
+      <w:r>
+        <w:rPr>
+          <w:rFonts w:ascii="Calibri" w:hAnsi="Calibri" w:cs="Calibri"/>
+          <w:b/>
+          <w:bCs/>
+          <w:color w:val="D86DCB" w:themeColor="accent5" w:themeTint="99"/>
+          <w:sz w:val="36"/>
+          <w:szCs w:val="36"/>
+        </w:rPr>
+        <w:t>operation(</w:t>
+      </w:r>
+      <w:proofErr w:type="gramEnd"/>
+      <w:r>
+        <w:rPr>
+          <w:rFonts w:ascii="Calibri" w:hAnsi="Calibri" w:cs="Calibri"/>
+          <w:b/>
+          <w:bCs/>
+          <w:color w:val="D86DCB" w:themeColor="accent5" w:themeTint="99"/>
+          <w:sz w:val="36"/>
+          <w:szCs w:val="36"/>
+        </w:rPr>
+        <w:t>10, 20)</w:t>
+      </w:r>
+    </w:p>
+    <w:p>
+      <w:pPr>
+        <w:jc w:val="both"/>
+        <w:rPr>
+          <w:rFonts w:ascii="Calibri" w:hAnsi="Calibri" w:cs="Calibri"/>
+          <w:b/>
+          <w:bCs/>
+          <w:color w:val="D86DCB" w:themeColor="accent5" w:themeTint="99"/>
+          <w:sz w:val="36"/>
+          <w:szCs w:val="36"/>
+        </w:rPr>
+      </w:pPr>
+      <w:r>
+        <w:rPr>
+          <w:rFonts w:ascii="Calibri" w:hAnsi="Calibri" w:cs="Calibri"/>
+          <w:b/>
+          <w:bCs/>
+          <w:color w:val="D86DCB" w:themeColor="accent5" w:themeTint="99"/>
+          <w:sz w:val="36"/>
+          <w:szCs w:val="36"/>
+        </w:rPr>
+        <w:t xml:space="preserve">result = </w:t>
+      </w:r>
+      <w:proofErr w:type="gramStart"/>
+      <w:r>
+        <w:rPr>
+          <w:rFonts w:ascii="Calibri" w:hAnsi="Calibri" w:cs="Calibri"/>
+          <w:b/>
+          <w:bCs/>
+          <w:color w:val="D86DCB" w:themeColor="accent5" w:themeTint="99"/>
+          <w:sz w:val="36"/>
+          <w:szCs w:val="36"/>
+        </w:rPr>
+        <w:t>calculate(</w:t>
+      </w:r>
+      <w:proofErr w:type="gramEnd"/>
+      <w:r>
+        <w:rPr>
+          <w:rFonts w:ascii="Calibri" w:hAnsi="Calibri" w:cs="Calibri"/>
+          <w:b/>
+          <w:bCs/>
+          <w:color w:val="D86DCB" w:themeColor="accent5" w:themeTint="99"/>
+          <w:sz w:val="36"/>
+          <w:szCs w:val="36"/>
+        </w:rPr>
+        <w:t>operation = lambda x, y : x + y)</w:t>
       </w:r>
     </w:p>
     <w:p>
@@ -3264,6 +3893,7 @@
                 <w:szCs w:val="36"/>
               </w:rPr>
             </w:pPr>
+            <w:proofErr w:type="spellStart"/>
             <w:r>
               <w:rPr>
                 <w:rFonts w:ascii="Calibri" w:hAnsi="Calibri" w:cs="Calibri"/>
@@ -3272,6 +3902,7 @@
               </w:rPr>
               <w:t>VoidCallback</w:t>
             </w:r>
+            <w:proofErr w:type="spellEnd"/>
           </w:p>
         </w:tc>
         <w:tc>
@@ -3292,6 +3923,7 @@
                 <w:szCs w:val="36"/>
               </w:rPr>
             </w:pPr>
+            <w:proofErr w:type="gramStart"/>
             <w:r>
               <w:rPr>
                 <w:rFonts w:ascii="Calibri" w:hAnsi="Calibri" w:cs="Calibri"/>
@@ -3300,7 +3932,18 @@
                 <w:sz w:val="36"/>
                 <w:szCs w:val="36"/>
               </w:rPr>
-              <w:t>Callable[[], None] (optional type hint)</w:t>
+              <w:t>Callable[</w:t>
+            </w:r>
+            <w:proofErr w:type="gramEnd"/>
+            <w:r>
+              <w:rPr>
+                <w:rFonts w:ascii="Calibri" w:hAnsi="Calibri" w:cs="Calibri"/>
+                <w:b/>
+                <w:bCs/>
+                <w:sz w:val="36"/>
+                <w:szCs w:val="36"/>
+              </w:rPr>
+              <w:t>[], None] (optional type hint)</w:t>
             </w:r>
           </w:p>
         </w:tc>
@@ -3383,13 +4026,23 @@
                 <w:szCs w:val="36"/>
               </w:rPr>
             </w:pPr>
+            <w:proofErr w:type="gramStart"/>
             <w:r>
               <w:rPr>
                 <w:rFonts w:ascii="Calibri" w:hAnsi="Calibri" w:cs="Calibri"/>
                 <w:sz w:val="36"/>
                 <w:szCs w:val="36"/>
               </w:rPr>
-              <w:t>Function(int, int)</w:t>
+              <w:t>Function(</w:t>
+            </w:r>
+            <w:proofErr w:type="gramEnd"/>
+            <w:r>
+              <w:rPr>
+                <w:rFonts w:ascii="Calibri" w:hAnsi="Calibri" w:cs="Calibri"/>
+                <w:sz w:val="36"/>
+                <w:szCs w:val="36"/>
+              </w:rPr>
+              <w:t>int, int)</w:t>
             </w:r>
           </w:p>
         </w:tc>
@@ -3411,6 +4064,7 @@
                 <w:szCs w:val="36"/>
               </w:rPr>
             </w:pPr>
+            <w:proofErr w:type="gramStart"/>
             <w:r>
               <w:rPr>
                 <w:rFonts w:ascii="Calibri" w:hAnsi="Calibri" w:cs="Calibri"/>
@@ -3419,7 +4073,40 @@
                 <w:sz w:val="36"/>
                 <w:szCs w:val="36"/>
               </w:rPr>
-              <w:t>Callable[[int, int], ReturnType]</w:t>
+              <w:t>Callable[</w:t>
+            </w:r>
+            <w:proofErr w:type="gramEnd"/>
+            <w:r>
+              <w:rPr>
+                <w:rFonts w:ascii="Calibri" w:hAnsi="Calibri" w:cs="Calibri"/>
+                <w:b/>
+                <w:bCs/>
+                <w:sz w:val="36"/>
+                <w:szCs w:val="36"/>
+              </w:rPr>
+              <w:t xml:space="preserve">[int, int], </w:t>
+            </w:r>
+            <w:proofErr w:type="spellStart"/>
+            <w:r>
+              <w:rPr>
+                <w:rFonts w:ascii="Calibri" w:hAnsi="Calibri" w:cs="Calibri"/>
+                <w:b/>
+                <w:bCs/>
+                <w:sz w:val="36"/>
+                <w:szCs w:val="36"/>
+              </w:rPr>
+              <w:t>ReturnType</w:t>
+            </w:r>
+            <w:proofErr w:type="spellEnd"/>
+            <w:r>
+              <w:rPr>
+                <w:rFonts w:ascii="Calibri" w:hAnsi="Calibri" w:cs="Calibri"/>
+                <w:b/>
+                <w:bCs/>
+                <w:sz w:val="36"/>
+                <w:szCs w:val="36"/>
+              </w:rPr>
+              <w:t>]</w:t>
             </w:r>
           </w:p>
         </w:tc>

</xml_diff>